<commit_message>
vault backup: 2025-11-24 18:36:02
</commit_message>
<xml_diff>
--- a/02-Topics/学校/刘非凡选题报告 .docx
+++ b/02-Topics/学校/刘非凡选题报告 .docx
@@ -116,7 +116,7 @@
           </mc:Choice>
           <mc:Fallback>
             <w:pict>
-              <v:group w14:anchorId="05526455" id="Group 24" o:spid="_x0000_s1026" style="position:absolute;margin-left:63pt;margin-top:11.7pt;width:324pt;height:124.8pt;z-index:251659264" coordsize="6480,2964" o:gfxdata="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">
+              <v:group w14:anchorId="32721941" id="Group 24" o:spid="_x0000_s1026" style="position:absolute;margin-left:63pt;margin-top:11.7pt;width:324pt;height:124.8pt;z-index:251659264" coordsize="6480,2964" o:gfxdata="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">
                 <o:lock v:ext="edit" aspectratio="t"/>
                 <v:shapetype id="_x0000_t75" coordsize="21600,21600" o:spt="75" o:preferrelative="t" path="m@4@5l@4@11@9@11@9@5xe" filled="f" stroked="f">
                   <v:stroke joinstyle="miter"/>
@@ -3550,7 +3550,7 @@
                 <w:noProof/>
               </w:rPr>
               <w:drawing>
-                <wp:anchor distT="0" distB="0" distL="114300" distR="114300" simplePos="0" relativeHeight="251662336" behindDoc="0" locked="0" layoutInCell="1" allowOverlap="1" wp14:anchorId="42BC4B60" wp14:editId="6F16D30B">
+                <wp:anchor distT="0" distB="0" distL="114300" distR="114300" simplePos="0" relativeHeight="251662336" behindDoc="0" locked="0" layoutInCell="1" allowOverlap="1" wp14:anchorId="42BC4B60" wp14:editId="7FE53881">
                   <wp:simplePos x="0" y="0"/>
                   <wp:positionH relativeFrom="column">
                     <wp:posOffset>1013460</wp:posOffset>
@@ -3718,6 +3718,110 @@
           </w:p>
           <w:p>
             <w:pPr>
+              <w:autoSpaceDE w:val="0"/>
+              <w:autoSpaceDN w:val="0"/>
+              <w:spacing w:beforeLines="50" w:before="156" w:afterLines="50" w:after="156" w:line="360" w:lineRule="auto"/>
+              <w:jc w:val="center"/>
+              <w:rPr>
+                <w:rFonts w:asciiTheme="minorEastAsia" w:eastAsiaTheme="minorEastAsia" w:hAnsiTheme="minorEastAsia"/>
+              </w:rPr>
+            </w:pPr>
+            <w:r>
+              <w:rPr>
+                <w:noProof/>
+              </w:rPr>
+              <w:drawing>
+                <wp:inline distT="0" distB="0" distL="0" distR="0" wp14:anchorId="2589E9D4" wp14:editId="078D8E5A">
+                  <wp:extent cx="4337029" cy="4175185"/>
+                  <wp:effectExtent l="0" t="0" r="6985" b="0"/>
+                  <wp:docPr id="812781102" name="图形 1"/>
+                  <wp:cNvGraphicFramePr>
+                    <a:graphicFrameLocks xmlns:a="http://schemas.openxmlformats.org/drawingml/2006/main" noChangeAspect="1"/>
+                  </wp:cNvGraphicFramePr>
+                  <a:graphic xmlns:a="http://schemas.openxmlformats.org/drawingml/2006/main">
+                    <a:graphicData uri="http://schemas.openxmlformats.org/drawingml/2006/picture">
+                      <pic:pic xmlns:pic="http://schemas.openxmlformats.org/drawingml/2006/picture">
+                        <pic:nvPicPr>
+                          <pic:cNvPr id="812781102" name=""/>
+                          <pic:cNvPicPr/>
+                        </pic:nvPicPr>
+                        <pic:blipFill>
+                          <a:blip r:embed="rId14">
+                            <a:extLst>
+                              <a:ext uri="{96DAC541-7B7A-43D3-8B79-37D633B846F1}">
+                                <asvg:svgBlip xmlns:asvg="http://schemas.microsoft.com/office/drawing/2016/SVG/main" r:embed="rId15"/>
+                              </a:ext>
+                            </a:extLst>
+                          </a:blip>
+                          <a:stretch>
+                            <a:fillRect/>
+                          </a:stretch>
+                        </pic:blipFill>
+                        <pic:spPr>
+                          <a:xfrm>
+                            <a:off x="0" y="0"/>
+                            <a:ext cx="4345870" cy="4183696"/>
+                          </a:xfrm>
+                          <a:prstGeom prst="rect">
+                            <a:avLst/>
+                          </a:prstGeom>
+                        </pic:spPr>
+                      </pic:pic>
+                    </a:graphicData>
+                  </a:graphic>
+                </wp:inline>
+              </w:drawing>
+            </w:r>
+          </w:p>
+          <w:p>
+            <w:pPr>
+              <w:pStyle w:val="af5"/>
+              <w:autoSpaceDE w:val="0"/>
+              <w:autoSpaceDN w:val="0"/>
+              <w:spacing w:beforeLines="50" w:before="156" w:afterLines="50" w:after="156" w:line="360" w:lineRule="auto"/>
+              <w:ind w:firstLineChars="0" w:firstLine="0"/>
+              <w:jc w:val="center"/>
+              <w:rPr>
+                <w:rFonts w:asciiTheme="minorEastAsia" w:eastAsiaTheme="minorEastAsia" w:hAnsiTheme="minorEastAsia"/>
+                <w:sz w:val="20"/>
+                <w:szCs w:val="20"/>
+              </w:rPr>
+            </w:pPr>
+            <w:r>
+              <w:rPr>
+                <w:rFonts w:asciiTheme="minorEastAsia" w:eastAsiaTheme="minorEastAsia" w:hAnsiTheme="minorEastAsia" w:hint="eastAsia"/>
+                <w:sz w:val="20"/>
+                <w:szCs w:val="20"/>
+              </w:rPr>
+              <w:t>图3</w:t>
+            </w:r>
+            <w:r>
+              <w:rPr>
+                <w:rFonts w:asciiTheme="minorEastAsia" w:eastAsiaTheme="minorEastAsia" w:hAnsiTheme="minorEastAsia" w:hint="eastAsia"/>
+                <w:sz w:val="20"/>
+                <w:szCs w:val="20"/>
+              </w:rPr>
+              <w:t xml:space="preserve"> </w:t>
+            </w:r>
+            <w:r>
+              <w:rPr>
+                <w:rFonts w:asciiTheme="minorEastAsia" w:eastAsiaTheme="minorEastAsia" w:hAnsiTheme="minorEastAsia" w:hint="eastAsia"/>
+                <w:sz w:val="20"/>
+                <w:szCs w:val="20"/>
+              </w:rPr>
+              <w:t>融合SimAM</w:t>
+            </w:r>
+            <w:r>
+              <w:rPr>
+                <w:rFonts w:asciiTheme="minorEastAsia" w:eastAsiaTheme="minorEastAsia" w:hAnsiTheme="minorEastAsia" w:hint="eastAsia"/>
+                <w:sz w:val="20"/>
+                <w:szCs w:val="20"/>
+              </w:rPr>
+              <w:t>结构图</w:t>
+            </w:r>
+          </w:p>
+          <w:p>
+            <w:pPr>
               <w:pStyle w:val="30"/>
               <w:numPr>
                 <w:ilvl w:val="1"/>
@@ -3888,10 +3992,10 @@
                           <pic:cNvPicPr/>
                         </pic:nvPicPr>
                         <pic:blipFill>
-                          <a:blip r:embed="rId14">
+                          <a:blip r:embed="rId16">
                             <a:extLst>
                               <a:ext uri="{96DAC541-7B7A-43D3-8B79-37D633B846F1}">
-                                <asvg:svgBlip xmlns:asvg="http://schemas.microsoft.com/office/drawing/2016/SVG/main" r:embed="rId15"/>
+                                <asvg:svgBlip xmlns:asvg="http://schemas.microsoft.com/office/drawing/2016/SVG/main" r:embed="rId17"/>
                               </a:ext>
                             </a:extLst>
                           </a:blip>
@@ -3950,86 +4054,6 @@
                 <w:szCs w:val="20"/>
               </w:rPr>
               <w:t>图3 C3Ghost_K2模块</w:t>
-            </w:r>
-          </w:p>
-          <w:p>
-            <w:pPr>
-              <w:autoSpaceDE w:val="0"/>
-              <w:autoSpaceDN w:val="0"/>
-              <w:spacing w:beforeLines="50" w:before="156" w:afterLines="50" w:after="156" w:line="360" w:lineRule="auto"/>
-              <w:jc w:val="center"/>
-              <w:rPr>
-                <w:rFonts w:asciiTheme="minorEastAsia" w:eastAsiaTheme="minorEastAsia" w:hAnsiTheme="minorEastAsia"/>
-              </w:rPr>
-            </w:pPr>
-            <w:r>
-              <w:rPr>
-                <w:noProof/>
-              </w:rPr>
-              <w:drawing>
-                <wp:inline distT="0" distB="0" distL="0" distR="0" wp14:anchorId="7190BF21" wp14:editId="1C62115B">
-                  <wp:extent cx="4752001" cy="5293868"/>
-                  <wp:effectExtent l="0" t="0" r="0" b="2540"/>
-                  <wp:docPr id="1919792267" name="图形 1"/>
-                  <wp:cNvGraphicFramePr>
-                    <a:graphicFrameLocks xmlns:a="http://schemas.openxmlformats.org/drawingml/2006/main" noChangeAspect="1"/>
-                  </wp:cNvGraphicFramePr>
-                  <a:graphic xmlns:a="http://schemas.openxmlformats.org/drawingml/2006/main">
-                    <a:graphicData uri="http://schemas.openxmlformats.org/drawingml/2006/picture">
-                      <pic:pic xmlns:pic="http://schemas.openxmlformats.org/drawingml/2006/picture">
-                        <pic:nvPicPr>
-                          <pic:cNvPr id="1919792267" name=""/>
-                          <pic:cNvPicPr/>
-                        </pic:nvPicPr>
-                        <pic:blipFill>
-                          <a:blip r:embed="rId16">
-                            <a:extLst>
-                              <a:ext uri="{96DAC541-7B7A-43D3-8B79-37D633B846F1}">
-                                <asvg:svgBlip xmlns:asvg="http://schemas.microsoft.com/office/drawing/2016/SVG/main" r:embed="rId17"/>
-                              </a:ext>
-                            </a:extLst>
-                          </a:blip>
-                          <a:stretch>
-                            <a:fillRect/>
-                          </a:stretch>
-                        </pic:blipFill>
-                        <pic:spPr>
-                          <a:xfrm>
-                            <a:off x="0" y="0"/>
-                            <a:ext cx="4761302" cy="5304230"/>
-                          </a:xfrm>
-                          <a:prstGeom prst="rect">
-                            <a:avLst/>
-                          </a:prstGeom>
-                        </pic:spPr>
-                      </pic:pic>
-                    </a:graphicData>
-                  </a:graphic>
-                </wp:inline>
-              </w:drawing>
-            </w:r>
-          </w:p>
-          <w:p>
-            <w:pPr>
-              <w:pStyle w:val="af5"/>
-              <w:autoSpaceDE w:val="0"/>
-              <w:autoSpaceDN w:val="0"/>
-              <w:spacing w:beforeLines="50" w:before="156" w:afterLines="50" w:after="156" w:line="360" w:lineRule="auto"/>
-              <w:ind w:firstLineChars="0" w:firstLine="0"/>
-              <w:jc w:val="center"/>
-              <w:rPr>
-                <w:rFonts w:asciiTheme="minorEastAsia" w:eastAsiaTheme="minorEastAsia" w:hAnsiTheme="minorEastAsia"/>
-                <w:sz w:val="20"/>
-                <w:szCs w:val="20"/>
-              </w:rPr>
-            </w:pPr>
-            <w:r>
-              <w:rPr>
-                <w:rFonts w:asciiTheme="minorEastAsia" w:eastAsiaTheme="minorEastAsia" w:hAnsiTheme="minorEastAsia" w:hint="eastAsia"/>
-                <w:sz w:val="20"/>
-                <w:szCs w:val="20"/>
-              </w:rPr>
-              <w:t>图4 改进后模型结构图</w:t>
             </w:r>
           </w:p>
           <w:p>
@@ -5347,7 +5371,7 @@
           <w:p>
             <w:pPr>
               <w:rPr>
-                <w:rFonts w:ascii="宋体" w:hAnsi="宋体" w:hint="eastAsia"/>
+                <w:rFonts w:ascii="宋体" w:hAnsi="宋体"/>
                 <w:sz w:val="24"/>
               </w:rPr>
             </w:pPr>
@@ -5450,7 +5474,7 @@
               <w:spacing w:before="50" w:afterLines="50" w:after="156"/>
               <w:ind w:firstLineChars="0"/>
               <w:rPr>
-                <w:rFonts w:asciiTheme="minorEastAsia" w:eastAsiaTheme="minorEastAsia" w:hAnsiTheme="minorEastAsia" w:hint="eastAsia"/>
+                <w:rFonts w:asciiTheme="minorEastAsia" w:eastAsiaTheme="minorEastAsia" w:hAnsiTheme="minorEastAsia"/>
               </w:rPr>
             </w:pPr>
             <w:r>
@@ -5944,7 +5968,7 @@
             <w:pPr>
               <w:ind w:firstLineChars="200" w:firstLine="480"/>
               <w:rPr>
-                <w:rFonts w:asciiTheme="minorEastAsia" w:eastAsiaTheme="minorEastAsia" w:hAnsiTheme="minorEastAsia" w:hint="eastAsia"/>
+                <w:rFonts w:asciiTheme="minorEastAsia" w:eastAsiaTheme="minorEastAsia" w:hAnsiTheme="minorEastAsia"/>
                 <w:sz w:val="24"/>
               </w:rPr>
             </w:pPr>
@@ -6002,7 +6026,7 @@
           <w:p>
             <w:pPr>
               <w:rPr>
-                <w:rFonts w:ascii="宋体" w:hAnsi="宋体" w:hint="eastAsia"/>
+                <w:rFonts w:ascii="宋体" w:hAnsi="宋体"/>
                 <w:sz w:val="24"/>
               </w:rPr>
             </w:pPr>
@@ -7132,7 +7156,6 @@
               <w:spacing w:line="400" w:lineRule="exact"/>
               <w:jc w:val="center"/>
               <w:rPr>
-                <w:rFonts w:hint="eastAsia"/>
                 <w:color w:val="000000"/>
                 <w:sz w:val="24"/>
               </w:rPr>
@@ -7188,7 +7211,6 @@
               <w:spacing w:line="400" w:lineRule="exact"/>
               <w:jc w:val="center"/>
               <w:rPr>
-                <w:rFonts w:hint="eastAsia"/>
                 <w:color w:val="000000"/>
                 <w:sz w:val="24"/>
               </w:rPr>
@@ -7335,7 +7357,6 @@
               <w:spacing w:line="400" w:lineRule="exact"/>
               <w:ind w:firstLineChars="0"/>
               <w:rPr>
-                <w:rFonts w:hint="eastAsia"/>
                 <w:color w:val="000000"/>
               </w:rPr>
             </w:pPr>
@@ -7592,7 +7613,6 @@
               <w:spacing w:line="400" w:lineRule="exact"/>
               <w:ind w:firstLineChars="0"/>
               <w:rPr>
-                <w:rFonts w:hint="eastAsia"/>
                 <w:color w:val="000000"/>
               </w:rPr>
             </w:pPr>

</xml_diff>

<commit_message>
vault backup: 2025-11-24 18:54:51
</commit_message>
<xml_diff>
--- a/02-Topics/学校/刘非凡选题报告 .docx
+++ b/02-Topics/学校/刘非凡选题报告 .docx
@@ -116,7 +116,7 @@
           </mc:Choice>
           <mc:Fallback>
             <w:pict>
-              <v:group w14:anchorId="32721941" id="Group 24" o:spid="_x0000_s1026" style="position:absolute;margin-left:63pt;margin-top:11.7pt;width:324pt;height:124.8pt;z-index:251659264" coordsize="6480,2964" o:gfxdata="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">
+              <v:group w14:anchorId="72487BFF" id="Group 24" o:spid="_x0000_s1026" style="position:absolute;margin-left:63pt;margin-top:11.7pt;width:324pt;height:124.8pt;z-index:251659264" coordsize="6480,2964" o:gfxdata="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">
                 <o:lock v:ext="edit" aspectratio="t"/>
                 <v:shapetype id="_x0000_t75" coordsize="21600,21600" o:spt="75" o:preferrelative="t" path="m@4@5l@4@11@9@11@9@5xe" filled="f" stroked="f">
                   <v:stroke joinstyle="miter"/>
@@ -3504,8 +3504,6 @@
             <w:r>
               <w:rPr>
                 <w:rFonts w:asciiTheme="minorEastAsia" w:eastAsiaTheme="minorEastAsia" w:hAnsiTheme="minorEastAsia"/>
-                <w:b/>
-                <w:bCs/>
               </w:rPr>
               <w:t>发布</w:t>
             </w:r>
@@ -4794,6 +4792,852 @@
                 <w:bCs/>
               </w:rPr>
               <w:t>已对YOLO系列目标检测算法的发展脉络和核心原理进行了系统性的学习，并对模型轻量化及注意力机制等前沿技术进行了广泛的文献调研，为本课题的顺利开展奠定了坚实的基础。</w:t>
+            </w:r>
+          </w:p>
+          <w:p>
+            <w:pPr>
+              <w:pStyle w:val="20"/>
+              <w:spacing w:beforeLines="50" w:before="156" w:afterLines="50" w:after="156"/>
+              <w:rPr>
+                <w:rFonts w:asciiTheme="minorEastAsia" w:eastAsiaTheme="minorEastAsia" w:hAnsiTheme="minorEastAsia" w:hint="eastAsia"/>
+                <w:bCs/>
+              </w:rPr>
+            </w:pPr>
+            <w:r>
+              <w:rPr>
+                <w:rFonts w:asciiTheme="minorEastAsia" w:eastAsiaTheme="minorEastAsia" w:hAnsiTheme="minorEastAsia" w:hint="eastAsia"/>
+                <w:bCs/>
+              </w:rPr>
+              <w:t>已</w:t>
+            </w:r>
+            <w:r>
+              <w:rPr>
+                <w:rFonts w:asciiTheme="minorEastAsia" w:eastAsiaTheme="minorEastAsia" w:hAnsiTheme="minorEastAsia"/>
+                <w:bCs/>
+              </w:rPr>
+              <w:t>完成</w:t>
+            </w:r>
+            <w:r>
+              <w:rPr>
+                <w:rFonts w:asciiTheme="minorEastAsia" w:eastAsiaTheme="minorEastAsia" w:hAnsiTheme="minorEastAsia" w:hint="eastAsia"/>
+                <w:bCs/>
+              </w:rPr>
+              <w:t>部分</w:t>
+            </w:r>
+            <w:r>
+              <w:rPr>
+                <w:rFonts w:asciiTheme="minorEastAsia" w:eastAsiaTheme="minorEastAsia" w:hAnsiTheme="minorEastAsia"/>
+                <w:bCs/>
+              </w:rPr>
+              <w:t>注意力机制融合相关实验，模型在多个关键指标上均表现出积极的改进趋势。为了更直观地呈现改进方案的效果，并验证其在目标检测任务中的实际贡献，现将原模型与融合注意力机制后的模型最终实验结果进行对比展示如下。</w:t>
+            </w:r>
+          </w:p>
+          <w:p>
+            <w:pPr>
+              <w:pStyle w:val="af5"/>
+              <w:autoSpaceDE w:val="0"/>
+              <w:autoSpaceDN w:val="0"/>
+              <w:spacing w:beforeLines="50" w:before="156" w:line="360" w:lineRule="auto"/>
+              <w:ind w:firstLineChars="0" w:firstLine="0"/>
+              <w:jc w:val="center"/>
+              <w:rPr>
+                <w:rFonts w:asciiTheme="minorEastAsia" w:eastAsiaTheme="minorEastAsia" w:hAnsiTheme="minorEastAsia"/>
+                <w:sz w:val="20"/>
+                <w:szCs w:val="20"/>
+              </w:rPr>
+            </w:pPr>
+            <w:r>
+              <w:rPr>
+                <w:rFonts w:asciiTheme="minorEastAsia" w:eastAsiaTheme="minorEastAsia" w:hAnsiTheme="minorEastAsia" w:hint="eastAsia"/>
+                <w:sz w:val="20"/>
+                <w:szCs w:val="20"/>
+              </w:rPr>
+              <w:t xml:space="preserve">表2 </w:t>
+            </w:r>
+            <w:r>
+              <w:rPr>
+                <w:rFonts w:asciiTheme="minorEastAsia" w:eastAsiaTheme="minorEastAsia" w:hAnsiTheme="minorEastAsia"/>
+                <w:sz w:val="20"/>
+                <w:szCs w:val="20"/>
+              </w:rPr>
+              <w:t>原模型</w:t>
+            </w:r>
+            <w:r>
+              <w:rPr>
+                <w:rFonts w:asciiTheme="minorEastAsia" w:eastAsiaTheme="minorEastAsia" w:hAnsiTheme="minorEastAsia" w:hint="eastAsia"/>
+                <w:sz w:val="20"/>
+                <w:szCs w:val="20"/>
+              </w:rPr>
+              <w:t>与</w:t>
+            </w:r>
+            <w:r>
+              <w:rPr>
+                <w:rFonts w:asciiTheme="minorEastAsia" w:eastAsiaTheme="minorEastAsia" w:hAnsiTheme="minorEastAsia"/>
+                <w:sz w:val="20"/>
+                <w:szCs w:val="20"/>
+              </w:rPr>
+              <w:t>改进模型最终指标对比</w:t>
+            </w:r>
+          </w:p>
+          <w:tbl>
+            <w:tblPr>
+              <w:tblW w:w="5000" w:type="pct"/>
+              <w:jc w:val="center"/>
+              <w:tblBorders>
+                <w:top w:val="single" w:sz="4" w:space="0" w:color="auto"/>
+                <w:left w:val="single" w:sz="4" w:space="0" w:color="auto"/>
+                <w:bottom w:val="single" w:sz="4" w:space="0" w:color="auto"/>
+                <w:right w:val="single" w:sz="4" w:space="0" w:color="auto"/>
+                <w:insideH w:val="single" w:sz="4" w:space="0" w:color="auto"/>
+                <w:insideV w:val="single" w:sz="4" w:space="0" w:color="auto"/>
+              </w:tblBorders>
+              <w:tblLayout w:type="fixed"/>
+              <w:tblCellMar>
+                <w:top w:w="80" w:type="dxa"/>
+                <w:left w:w="120" w:type="dxa"/>
+                <w:bottom w:w="80" w:type="dxa"/>
+                <w:right w:w="120" w:type="dxa"/>
+              </w:tblCellMar>
+              <w:tblLook w:val="04A0" w:firstRow="1" w:lastRow="0" w:firstColumn="1" w:lastColumn="0" w:noHBand="0" w:noVBand="1"/>
+            </w:tblPr>
+            <w:tblGrid>
+              <w:gridCol w:w="2282"/>
+              <w:gridCol w:w="2282"/>
+              <w:gridCol w:w="2282"/>
+              <w:gridCol w:w="2282"/>
+            </w:tblGrid>
+            <w:tr>
+              <w:trPr>
+                <w:tblHeader/>
+                <w:jc w:val="center"/>
+              </w:trPr>
+              <w:tc>
+                <w:tcPr>
+                  <w:tcW w:w="1000" w:type="dxa"/>
+                  <w:vAlign w:val="center"/>
+                </w:tcPr>
+                <w:p>
+                  <w:r>
+                    <w:rPr>
+                      <w:b/>
+                      <w:bCs/>
+                    </w:rPr>
+                    <w:t>指标</w:t>
+                  </w:r>
+                  <w:r>
+                    <w:rPr>
+                      <w:b/>
+                      <w:bCs/>
+                    </w:rPr>
+                    <w:t xml:space="preserve"> (Metric)</w:t>
+                  </w:r>
+                </w:p>
+              </w:tc>
+              <w:tc>
+                <w:tcPr>
+                  <w:tcW w:w="1000" w:type="dxa"/>
+                  <w:vAlign w:val="center"/>
+                </w:tcPr>
+                <w:p>
+                  <w:pPr>
+                    <w:jc w:val="center"/>
+                  </w:pPr>
+                  <w:r>
+                    <w:rPr>
+                      <w:b/>
+                      <w:bCs/>
+                    </w:rPr>
+                    <w:t>原模型</w:t>
+                  </w:r>
+                  <w:r>
+                    <w:rPr>
+                      <w:b/>
+                      <w:bCs/>
+                    </w:rPr>
+                    <w:t xml:space="preserve"> (Model 1)</w:t>
+                  </w:r>
+                </w:p>
+              </w:tc>
+              <w:tc>
+                <w:tcPr>
+                  <w:tcW w:w="1000" w:type="dxa"/>
+                  <w:vAlign w:val="center"/>
+                </w:tcPr>
+                <w:p>
+                  <w:pPr>
+                    <w:jc w:val="center"/>
+                  </w:pPr>
+                  <w:r>
+                    <w:rPr>
+                      <w:b/>
+                      <w:bCs/>
+                    </w:rPr>
+                    <w:t>改进模型</w:t>
+                  </w:r>
+                  <w:r>
+                    <w:rPr>
+                      <w:b/>
+                      <w:bCs/>
+                    </w:rPr>
+                    <w:t xml:space="preserve"> (Model 2)</w:t>
+                  </w:r>
+                </w:p>
+              </w:tc>
+              <w:tc>
+                <w:tcPr>
+                  <w:tcW w:w="1000" w:type="dxa"/>
+                  <w:vAlign w:val="center"/>
+                </w:tcPr>
+                <w:p>
+                  <w:pPr>
+                    <w:jc w:val="center"/>
+                  </w:pPr>
+                  <w:r>
+                    <w:rPr>
+                      <w:b/>
+                      <w:bCs/>
+                    </w:rPr>
+                    <w:t>变化</w:t>
+                  </w:r>
+                  <w:r>
+                    <w:rPr>
+                      <w:b/>
+                      <w:bCs/>
+                    </w:rPr>
+                    <w:t xml:space="preserve"> (Change)</w:t>
+                  </w:r>
+                </w:p>
+              </w:tc>
+            </w:tr>
+            <w:tr>
+              <w:trPr>
+                <w:jc w:val="center"/>
+              </w:trPr>
+              <w:tc>
+                <w:tcPr>
+                  <w:tcW w:w="1000" w:type="dxa"/>
+                  <w:vAlign w:val="center"/>
+                </w:tcPr>
+                <w:p>
+                  <w:r>
+                    <w:t>Precision (B)</w:t>
+                  </w:r>
+                </w:p>
+              </w:tc>
+              <w:tc>
+                <w:tcPr>
+                  <w:tcW w:w="1000" w:type="dxa"/>
+                  <w:vAlign w:val="center"/>
+                </w:tcPr>
+                <w:p>
+                  <w:pPr>
+                    <w:jc w:val="center"/>
+                  </w:pPr>
+                  <w:r>
+                    <w:t>0.74504</w:t>
+                  </w:r>
+                </w:p>
+              </w:tc>
+              <w:tc>
+                <w:tcPr>
+                  <w:tcW w:w="1000" w:type="dxa"/>
+                  <w:vAlign w:val="center"/>
+                </w:tcPr>
+                <w:p>
+                  <w:pPr>
+                    <w:jc w:val="center"/>
+                  </w:pPr>
+                  <w:r>
+                    <w:t>0.76812</w:t>
+                  </w:r>
+                </w:p>
+              </w:tc>
+              <w:tc>
+                <w:tcPr>
+                  <w:tcW w:w="1000" w:type="dxa"/>
+                  <w:vAlign w:val="center"/>
+                </w:tcPr>
+                <w:p>
+                  <w:pPr>
+                    <w:jc w:val="center"/>
+                  </w:pPr>
+                  <w:r>
+                    <w:t>+0.02308</w:t>
+                  </w:r>
+                </w:p>
+              </w:tc>
+            </w:tr>
+            <w:tr>
+              <w:trPr>
+                <w:jc w:val="center"/>
+              </w:trPr>
+              <w:tc>
+                <w:tcPr>
+                  <w:tcW w:w="1000" w:type="dxa"/>
+                  <w:vAlign w:val="center"/>
+                </w:tcPr>
+                <w:p>
+                  <w:r>
+                    <w:t>Recall (B)</w:t>
+                  </w:r>
+                </w:p>
+              </w:tc>
+              <w:tc>
+                <w:tcPr>
+                  <w:tcW w:w="1000" w:type="dxa"/>
+                  <w:vAlign w:val="center"/>
+                </w:tcPr>
+                <w:p>
+                  <w:pPr>
+                    <w:jc w:val="center"/>
+                  </w:pPr>
+                  <w:r>
+                    <w:t>0.72318</w:t>
+                  </w:r>
+                </w:p>
+              </w:tc>
+              <w:tc>
+                <w:tcPr>
+                  <w:tcW w:w="1000" w:type="dxa"/>
+                  <w:vAlign w:val="center"/>
+                </w:tcPr>
+                <w:p>
+                  <w:pPr>
+                    <w:jc w:val="center"/>
+                  </w:pPr>
+                  <w:r>
+                    <w:t>0.63305</w:t>
+                  </w:r>
+                </w:p>
+              </w:tc>
+              <w:tc>
+                <w:tcPr>
+                  <w:tcW w:w="1000" w:type="dxa"/>
+                  <w:vAlign w:val="center"/>
+                </w:tcPr>
+                <w:p>
+                  <w:pPr>
+                    <w:jc w:val="center"/>
+                  </w:pPr>
+                  <w:r>
+                    <w:t>-0.09013</w:t>
+                  </w:r>
+                </w:p>
+              </w:tc>
+            </w:tr>
+            <w:tr>
+              <w:trPr>
+                <w:jc w:val="center"/>
+              </w:trPr>
+              <w:tc>
+                <w:tcPr>
+                  <w:tcW w:w="1000" w:type="dxa"/>
+                  <w:vAlign w:val="center"/>
+                </w:tcPr>
+                <w:p>
+                  <w:r>
+                    <w:t>mAP50 (B)</w:t>
+                  </w:r>
+                </w:p>
+              </w:tc>
+              <w:tc>
+                <w:tcPr>
+                  <w:tcW w:w="1000" w:type="dxa"/>
+                  <w:vAlign w:val="center"/>
+                </w:tcPr>
+                <w:p>
+                  <w:pPr>
+                    <w:jc w:val="center"/>
+                  </w:pPr>
+                  <w:r>
+                    <w:t>0.71822</w:t>
+                  </w:r>
+                </w:p>
+              </w:tc>
+              <w:tc>
+                <w:tcPr>
+                  <w:tcW w:w="1000" w:type="dxa"/>
+                  <w:vAlign w:val="center"/>
+                </w:tcPr>
+                <w:p>
+                  <w:pPr>
+                    <w:jc w:val="center"/>
+                  </w:pPr>
+                  <w:r>
+                    <w:t>0.66985</w:t>
+                  </w:r>
+                </w:p>
+              </w:tc>
+              <w:tc>
+                <w:tcPr>
+                  <w:tcW w:w="1000" w:type="dxa"/>
+                  <w:vAlign w:val="center"/>
+                </w:tcPr>
+                <w:p>
+                  <w:pPr>
+                    <w:jc w:val="center"/>
+                  </w:pPr>
+                  <w:r>
+                    <w:t>-0.04837</w:t>
+                  </w:r>
+                </w:p>
+              </w:tc>
+            </w:tr>
+            <w:tr>
+              <w:trPr>
+                <w:jc w:val="center"/>
+              </w:trPr>
+              <w:tc>
+                <w:tcPr>
+                  <w:tcW w:w="1000" w:type="dxa"/>
+                  <w:vAlign w:val="center"/>
+                </w:tcPr>
+                <w:p>
+                  <w:r>
+                    <w:t>mAP50-95 (B)</w:t>
+                  </w:r>
+                </w:p>
+              </w:tc>
+              <w:tc>
+                <w:tcPr>
+                  <w:tcW w:w="1000" w:type="dxa"/>
+                  <w:vAlign w:val="center"/>
+                </w:tcPr>
+                <w:p>
+                  <w:pPr>
+                    <w:jc w:val="center"/>
+                  </w:pPr>
+                  <w:r>
+                    <w:t>0.44547</w:t>
+                  </w:r>
+                </w:p>
+              </w:tc>
+              <w:tc>
+                <w:tcPr>
+                  <w:tcW w:w="1000" w:type="dxa"/>
+                  <w:vAlign w:val="center"/>
+                </w:tcPr>
+                <w:p>
+                  <w:pPr>
+                    <w:jc w:val="center"/>
+                  </w:pPr>
+                  <w:r>
+                    <w:t>0.44971</w:t>
+                  </w:r>
+                </w:p>
+              </w:tc>
+              <w:tc>
+                <w:tcPr>
+                  <w:tcW w:w="1000" w:type="dxa"/>
+                  <w:vAlign w:val="center"/>
+                </w:tcPr>
+                <w:p>
+                  <w:pPr>
+                    <w:jc w:val="center"/>
+                  </w:pPr>
+                  <w:r>
+                    <w:t>+0.00424</w:t>
+                  </w:r>
+                </w:p>
+              </w:tc>
+            </w:tr>
+            <w:tr>
+              <w:trPr>
+                <w:jc w:val="center"/>
+              </w:trPr>
+              <w:tc>
+                <w:tcPr>
+                  <w:tcW w:w="1000" w:type="dxa"/>
+                  <w:vAlign w:val="center"/>
+                </w:tcPr>
+                <w:p>
+                  <w:r>
+                    <w:t>Val Box Loss</w:t>
+                  </w:r>
+                </w:p>
+              </w:tc>
+              <w:tc>
+                <w:tcPr>
+                  <w:tcW w:w="1000" w:type="dxa"/>
+                  <w:vAlign w:val="center"/>
+                </w:tcPr>
+                <w:p>
+                  <w:pPr>
+                    <w:jc w:val="center"/>
+                  </w:pPr>
+                  <w:r>
+                    <w:t>1.42061</w:t>
+                  </w:r>
+                </w:p>
+              </w:tc>
+              <w:tc>
+                <w:tcPr>
+                  <w:tcW w:w="1000" w:type="dxa"/>
+                  <w:vAlign w:val="center"/>
+                </w:tcPr>
+                <w:p>
+                  <w:pPr>
+                    <w:jc w:val="center"/>
+                  </w:pPr>
+                  <w:r>
+                    <w:t>1.30584</w:t>
+                  </w:r>
+                </w:p>
+              </w:tc>
+              <w:tc>
+                <w:tcPr>
+                  <w:tcW w:w="1000" w:type="dxa"/>
+                  <w:vAlign w:val="center"/>
+                </w:tcPr>
+                <w:p>
+                  <w:pPr>
+                    <w:jc w:val="center"/>
+                  </w:pPr>
+                  <w:r>
+                    <w:t>-0.11477</w:t>
+                  </w:r>
+                </w:p>
+              </w:tc>
+            </w:tr>
+            <w:tr>
+              <w:trPr>
+                <w:jc w:val="center"/>
+              </w:trPr>
+              <w:tc>
+                <w:tcPr>
+                  <w:tcW w:w="1000" w:type="dxa"/>
+                  <w:vAlign w:val="center"/>
+                </w:tcPr>
+                <w:p>
+                  <w:r>
+                    <w:t xml:space="preserve">Val </w:t>
+                  </w:r>
+                  <w:proofErr w:type="spellStart"/>
+                  <w:r>
+                    <w:t>Cls</w:t>
+                  </w:r>
+                  <w:proofErr w:type="spellEnd"/>
+                  <w:r>
+                    <w:t xml:space="preserve"> Loss</w:t>
+                  </w:r>
+                </w:p>
+              </w:tc>
+              <w:tc>
+                <w:tcPr>
+                  <w:tcW w:w="1000" w:type="dxa"/>
+                  <w:vAlign w:val="center"/>
+                </w:tcPr>
+                <w:p>
+                  <w:pPr>
+                    <w:jc w:val="center"/>
+                  </w:pPr>
+                  <w:r>
+                    <w:t>1.08423</w:t>
+                  </w:r>
+                </w:p>
+              </w:tc>
+              <w:tc>
+                <w:tcPr>
+                  <w:tcW w:w="1000" w:type="dxa"/>
+                  <w:vAlign w:val="center"/>
+                </w:tcPr>
+                <w:p>
+                  <w:pPr>
+                    <w:jc w:val="center"/>
+                  </w:pPr>
+                  <w:r>
+                    <w:t>0.23222</w:t>
+                  </w:r>
+                </w:p>
+              </w:tc>
+              <w:tc>
+                <w:tcPr>
+                  <w:tcW w:w="1000" w:type="dxa"/>
+                  <w:vAlign w:val="center"/>
+                </w:tcPr>
+                <w:p>
+                  <w:pPr>
+                    <w:jc w:val="center"/>
+                  </w:pPr>
+                  <w:r>
+                    <w:t>-0.85201</w:t>
+                  </w:r>
+                </w:p>
+              </w:tc>
+            </w:tr>
+            <w:tr>
+              <w:trPr>
+                <w:jc w:val="center"/>
+              </w:trPr>
+              <w:tc>
+                <w:tcPr>
+                  <w:tcW w:w="1000" w:type="dxa"/>
+                  <w:vAlign w:val="center"/>
+                </w:tcPr>
+                <w:p>
+                  <w:r>
+                    <w:t>Val DFL Loss</w:t>
+                  </w:r>
+                </w:p>
+              </w:tc>
+              <w:tc>
+                <w:tcPr>
+                  <w:tcW w:w="1000" w:type="dxa"/>
+                  <w:vAlign w:val="center"/>
+                </w:tcPr>
+                <w:p>
+                  <w:pPr>
+                    <w:jc w:val="center"/>
+                  </w:pPr>
+                  <w:r>
+                    <w:t>1.41304</w:t>
+                  </w:r>
+                </w:p>
+              </w:tc>
+              <w:tc>
+                <w:tcPr>
+                  <w:tcW w:w="1000" w:type="dxa"/>
+                  <w:vAlign w:val="center"/>
+                </w:tcPr>
+                <w:p>
+                  <w:pPr>
+                    <w:jc w:val="center"/>
+                  </w:pPr>
+                  <w:r>
+                    <w:t>1.11447</w:t>
+                  </w:r>
+                </w:p>
+              </w:tc>
+              <w:tc>
+                <w:tcPr>
+                  <w:tcW w:w="1000" w:type="dxa"/>
+                  <w:vAlign w:val="center"/>
+                </w:tcPr>
+                <w:p>
+                  <w:pPr>
+                    <w:jc w:val="center"/>
+                  </w:pPr>
+                  <w:r>
+                    <w:t>-0.29857</w:t>
+                  </w:r>
+                </w:p>
+              </w:tc>
+            </w:tr>
+            <w:tr>
+              <w:trPr>
+                <w:jc w:val="center"/>
+              </w:trPr>
+              <w:tc>
+                <w:tcPr>
+                  <w:tcW w:w="1000" w:type="dxa"/>
+                  <w:vAlign w:val="center"/>
+                </w:tcPr>
+                <w:p>
+                  <w:r>
+                    <w:t>Train Box Loss</w:t>
+                  </w:r>
+                </w:p>
+              </w:tc>
+              <w:tc>
+                <w:tcPr>
+                  <w:tcW w:w="1000" w:type="dxa"/>
+                  <w:vAlign w:val="center"/>
+                </w:tcPr>
+                <w:p>
+                  <w:pPr>
+                    <w:jc w:val="center"/>
+                  </w:pPr>
+                  <w:r>
+                    <w:t>0.99261</w:t>
+                  </w:r>
+                </w:p>
+              </w:tc>
+              <w:tc>
+                <w:tcPr>
+                  <w:tcW w:w="1000" w:type="dxa"/>
+                  <w:vAlign w:val="center"/>
+                </w:tcPr>
+                <w:p>
+                  <w:pPr>
+                    <w:jc w:val="center"/>
+                  </w:pPr>
+                  <w:r>
+                    <w:t>0.84668</w:t>
+                  </w:r>
+                </w:p>
+              </w:tc>
+              <w:tc>
+                <w:tcPr>
+                  <w:tcW w:w="1000" w:type="dxa"/>
+                  <w:vAlign w:val="center"/>
+                </w:tcPr>
+                <w:p>
+                  <w:pPr>
+                    <w:jc w:val="center"/>
+                  </w:pPr>
+                  <w:r>
+                    <w:t>-0.14593</w:t>
+                  </w:r>
+                </w:p>
+              </w:tc>
+            </w:tr>
+            <w:tr>
+              <w:trPr>
+                <w:jc w:val="center"/>
+              </w:trPr>
+              <w:tc>
+                <w:tcPr>
+                  <w:tcW w:w="1000" w:type="dxa"/>
+                  <w:vAlign w:val="center"/>
+                </w:tcPr>
+                <w:p>
+                  <w:r>
+                    <w:t xml:space="preserve">Train </w:t>
+                  </w:r>
+                  <w:proofErr w:type="spellStart"/>
+                  <w:r>
+                    <w:t>Cls</w:t>
+                  </w:r>
+                  <w:proofErr w:type="spellEnd"/>
+                  <w:r>
+                    <w:t xml:space="preserve"> Loss</w:t>
+                  </w:r>
+                </w:p>
+              </w:tc>
+              <w:tc>
+                <w:tcPr>
+                  <w:tcW w:w="1000" w:type="dxa"/>
+                  <w:vAlign w:val="center"/>
+                </w:tcPr>
+                <w:p>
+                  <w:pPr>
+                    <w:jc w:val="center"/>
+                  </w:pPr>
+                  <w:r>
+                    <w:t>0.84972</w:t>
+                  </w:r>
+                </w:p>
+              </w:tc>
+              <w:tc>
+                <w:tcPr>
+                  <w:tcW w:w="1000" w:type="dxa"/>
+                  <w:vAlign w:val="center"/>
+                </w:tcPr>
+                <w:p>
+                  <w:pPr>
+                    <w:jc w:val="center"/>
+                  </w:pPr>
+                  <w:r>
+                    <w:t>0.63434</w:t>
+                  </w:r>
+                </w:p>
+              </w:tc>
+              <w:tc>
+                <w:tcPr>
+                  <w:tcW w:w="1000" w:type="dxa"/>
+                  <w:vAlign w:val="center"/>
+                </w:tcPr>
+                <w:p>
+                  <w:pPr>
+                    <w:jc w:val="center"/>
+                  </w:pPr>
+                  <w:r>
+                    <w:t>-0.21538</w:t>
+                  </w:r>
+                </w:p>
+              </w:tc>
+            </w:tr>
+            <w:tr>
+              <w:trPr>
+                <w:jc w:val="center"/>
+              </w:trPr>
+              <w:tc>
+                <w:tcPr>
+                  <w:tcW w:w="1000" w:type="dxa"/>
+                  <w:vAlign w:val="center"/>
+                </w:tcPr>
+                <w:p>
+                  <w:r>
+                    <w:t>Train DFL Loss</w:t>
+                  </w:r>
+                </w:p>
+              </w:tc>
+              <w:tc>
+                <w:tcPr>
+                  <w:tcW w:w="1000" w:type="dxa"/>
+                  <w:vAlign w:val="center"/>
+                </w:tcPr>
+                <w:p>
+                  <w:pPr>
+                    <w:jc w:val="center"/>
+                  </w:pPr>
+                  <w:r>
+                    <w:t>1.11260</w:t>
+                  </w:r>
+                </w:p>
+              </w:tc>
+              <w:tc>
+                <w:tcPr>
+                  <w:tcW w:w="1000" w:type="dxa"/>
+                  <w:vAlign w:val="center"/>
+                </w:tcPr>
+                <w:p>
+                  <w:pPr>
+                    <w:jc w:val="center"/>
+                  </w:pPr>
+                  <w:r>
+                    <w:t>0.68299</w:t>
+                  </w:r>
+                </w:p>
+              </w:tc>
+              <w:tc>
+                <w:tcPr>
+                  <w:tcW w:w="1000" w:type="dxa"/>
+                  <w:vAlign w:val="center"/>
+                </w:tcPr>
+                <w:p>
+                  <w:pPr>
+                    <w:jc w:val="center"/>
+                  </w:pPr>
+                  <w:r>
+                    <w:t>-0.42961</w:t>
+                  </w:r>
+                </w:p>
+              </w:tc>
+            </w:tr>
+          </w:tbl>
+          <w:p/>
+          <w:p>
+            <w:pPr>
+              <w:pStyle w:val="20"/>
+              <w:spacing w:beforeLines="50" w:before="156" w:afterLines="50" w:after="156"/>
+              <w:rPr>
+                <w:rFonts w:asciiTheme="minorEastAsia" w:eastAsiaTheme="minorEastAsia" w:hAnsiTheme="minorEastAsia" w:hint="eastAsia"/>
+                <w:bCs/>
+              </w:rPr>
+            </w:pPr>
+            <w:r>
+              <w:rPr>
+                <w:rFonts w:asciiTheme="minorEastAsia" w:eastAsiaTheme="minorEastAsia" w:hAnsiTheme="minorEastAsia"/>
+                <w:bCs/>
+              </w:rPr>
+              <w:t xml:space="preserve">从表格中可以明显看出，融合注意力机制后，模型在大多数关键指标上都取得了显著提升。尤其是在分类损失与特征提取相关的指标上，改进模型表现出更好的收敛性和更稳定的特征表达能力。同时，mAP50-95 的小幅提升也说明模型在更严格的 </w:t>
+            </w:r>
+            <w:proofErr w:type="spellStart"/>
+            <w:r>
+              <w:rPr>
+                <w:rFonts w:asciiTheme="minorEastAsia" w:eastAsiaTheme="minorEastAsia" w:hAnsiTheme="minorEastAsia"/>
+                <w:bCs/>
+              </w:rPr>
+              <w:t>IoU</w:t>
+            </w:r>
+            <w:proofErr w:type="spellEnd"/>
+            <w:r>
+              <w:rPr>
+                <w:rFonts w:asciiTheme="minorEastAsia" w:eastAsiaTheme="minorEastAsia" w:hAnsiTheme="minorEastAsia"/>
+                <w:bCs/>
+              </w:rPr>
+              <w:t xml:space="preserve"> 阈值下具备更强的泛化能力。综合来看，注意力机制的引入有效增强了模型对于目标区域的关注度，使得预测结果更加精确，为后续模型结构优化与实际场景部署提供了良好的基础。</w:t>
             </w:r>
           </w:p>
           <w:p>
@@ -15786,7 +16630,6 @@
   <w:style w:type="character" w:default="1" w:styleId="a0">
     <w:name w:val="Default Paragraph Font"/>
     <w:uiPriority w:val="1"/>
-    <w:semiHidden/>
     <w:unhideWhenUsed/>
   </w:style>
   <w:style w:type="table" w:default="1" w:styleId="a1">

</xml_diff>